<commit_message>
Cele w dokumentacji zostaly zmienione
</commit_message>
<xml_diff>
--- a/dokumentacja.docx
+++ b/dokumentacja.docx
@@ -4,12 +4,30 @@
   <w:body>
     <w:p>
       <w:r>
-        <w:t xml:space="preserve">28.05.2026. – start projektu, muszę wymyśleć co chcę wykonać w ramach projektu </w:t>
+        <w:rPr>
+          <w:b/>
+        </w:rPr>
+        <w:t>28.05.2026.</w:t>
+      </w:r>
+      <w:r>
+        <w:t xml:space="preserve"> – start projektu, muszę wymyśleć co</w:t>
+      </w:r>
+      <w:r>
+        <w:t xml:space="preserve"> chcę wykonać; uczę się jak korzystać z github</w:t>
       </w:r>
     </w:p>
     <w:p>
       <w:r>
-        <w:t xml:space="preserve">Cel: </w:t>
+        <w:rPr>
+          <w:b/>
+        </w:rPr>
+        <w:t>Cel:</w:t>
+      </w:r>
+      <w:r>
+        <w:t xml:space="preserve"> </w:t>
+      </w:r>
+      <w:r>
+        <w:t xml:space="preserve"> Spróbować zrobić grę Snake. Ewentualnie jeśli to okaże się zbyt trudne to statki.</w:t>
       </w:r>
     </w:p>
     <w:sectPr>
@@ -181,6 +199,7 @@
   <w:style w:type="paragraph" w:default="1" w:styleId="Normalny">
     <w:name w:val="Normal"/>
     <w:qFormat/>
+    <w:rsid w:val="001D39AB"/>
   </w:style>
   <w:style w:type="character" w:default="1" w:styleId="Domylnaczcionkaakapitu">
     <w:name w:val="Default Paragraph Font"/>

</xml_diff>